<commit_message>
Add Introduction to Module 1
</commit_message>
<xml_diff>
--- a/Module 1/Introduction/MoffatBayMarinaProject_Introduction.docx
+++ b/Module 1/Introduction/MoffatBayMarinaProject_Introduction.docx
@@ -3,23 +3,109 @@
 <w:document xmlns:wpc="http://schemas.microsoft.com/office/word/2010/wordprocessingCanvas" xmlns:cx="http://schemas.microsoft.com/office/drawing/2014/chartex" xmlns:cx1="http://schemas.microsoft.com/office/drawing/2015/9/8/chartex" xmlns:cx2="http://schemas.microsoft.com/office/drawing/2015/10/21/chartex" xmlns:cx3="http://schemas.microsoft.com/office/drawing/2016/5/9/chartex" xmlns:cx4="http://schemas.microsoft.com/office/drawing/2016/5/10/chartex" xmlns:cx5="http://schemas.microsoft.com/office/drawing/2016/5/11/chartex" xmlns:cx6="http://schemas.microsoft.com/office/drawing/2016/5/12/chartex" xmlns:cx7="http://schemas.microsoft.com/office/drawing/2016/5/13/chartex" xmlns:cx8="http://schemas.microsoft.com/office/drawing/2016/5/14/chartex" xmlns:mc="http://schemas.openxmlformats.org/markup-compatibility/2006" xmlns:m="http://schemas.openxmlformats.org/officeDocument/2006/math" xmlns:aink="http://schemas.microsoft.com/office/drawing/2016/ink" xmlns:am3d="http://schemas.microsoft.com/office/drawing/2017/model3d" xmlns:oel="http://schemas.microsoft.com/office/2019/extlst" xmlns:r="http://schemas.openxmlformats.org/officeDocument/2006/relationships" xmlns:wp14="http://schemas.microsoft.com/office/word/2010/wordprocessingDrawing" xmlns:wp="http://schemas.openxmlformats.org/drawingml/2006/wordprocessingDrawing" xmlns:wpg="http://schemas.microsoft.com/office/word/2010/wordprocessingGroup" xmlns:wpi="http://schemas.microsoft.com/office/word/2010/wordprocessingInk" xmlns:wps="http://schemas.microsoft.com/office/word/2010/wordprocessingShape" xmlns:o="urn:schemas-microsoft-com:office:office" xmlns:v="urn:schemas-microsoft-com:vml" xmlns:w10="urn:schemas-microsoft-com:office:word" xmlns:w="http://schemas.openxmlformats.org/wordprocessingml/2006/main" xmlns:w14="http://schemas.microsoft.com/office/word/2010/wordml" xmlns:w15="http://schemas.microsoft.com/office/word/2012/wordml" xmlns:w16cex="http://schemas.microsoft.com/office/word/2018/wordml/cex" xmlns:w16cid="http://schemas.microsoft.com/office/word/2016/wordml/cid" xmlns:w16="http://schemas.microsoft.com/office/word/2018/wordml" xmlns:w16sdtdh="http://schemas.microsoft.com/office/word/2020/wordml/sdtdatahash" xmlns:w16sdtfl="http://schemas.microsoft.com/office/word/2024/wordml/sdtformatlock" xmlns:w16se="http://schemas.microsoft.com/office/word/2015/wordml/symex" xmlns:w16du="http://schemas.microsoft.com/office/word/2023/wordml/word16du" xmlns:wne="http://schemas.microsoft.com/office/word/2006/wordml" mc:Ignorable="w14 w15 w16se w16cid w16 w16cex w16sdtdh w16sdtfl w16du wp14">
   <w:body>
     <w:p>
-      <w:r>
+      <w:pPr>
+        <w:jc w:val="center"/>
+        <w:rPr>
+          <w:b/>
+          <w:bCs/>
+        </w:rPr>
+      </w:pPr>
+      <w:r>
+        <w:rPr>
+          <w:b/>
+          <w:bCs/>
+        </w:rPr>
         <w:t>Alexander Baldree</w:t>
+      </w:r>
+      <w:r>
+        <w:rPr>
+          <w:b/>
+          <w:bCs/>
+        </w:rPr>
+        <w:t xml:space="preserve">, </w:t>
+      </w:r>
+      <w:r>
+        <w:rPr>
+          <w:b/>
+          <w:bCs/>
+        </w:rPr>
+        <w:t>Jordan Dardar</w:t>
+      </w:r>
+      <w:r>
+        <w:rPr>
+          <w:b/>
+          <w:bCs/>
+        </w:rPr>
+        <w:t xml:space="preserve">, </w:t>
+      </w:r>
+      <w:r>
+        <w:rPr>
+          <w:b/>
+          <w:bCs/>
+        </w:rPr>
+        <w:t>Max Jankowski</w:t>
+      </w:r>
+      <w:r>
+        <w:rPr>
+          <w:b/>
+          <w:bCs/>
+        </w:rPr>
+        <w:t xml:space="preserve">, </w:t>
+      </w:r>
+      <w:proofErr w:type="spellStart"/>
+      <w:r>
+        <w:rPr>
+          <w:b/>
+          <w:bCs/>
+        </w:rPr>
+        <w:t>Aftabur</w:t>
+      </w:r>
+      <w:proofErr w:type="spellEnd"/>
+      <w:r>
+        <w:rPr>
+          <w:b/>
+          <w:bCs/>
+        </w:rPr>
+        <w:t xml:space="preserve"> Rahman</w:t>
       </w:r>
     </w:p>
     <w:p>
-      <w:r>
-        <w:t>08/13/26</w:t>
+      <w:pPr>
+        <w:jc w:val="center"/>
+        <w:rPr>
+          <w:b/>
+          <w:bCs/>
+        </w:rPr>
+      </w:pPr>
+      <w:r>
+        <w:rPr>
+          <w:b/>
+          <w:bCs/>
+        </w:rPr>
+        <w:t>Bellevue University</w:t>
       </w:r>
     </w:p>
     <w:p>
-      <w:r>
-        <w:t>Moffat Bay Marina – Introduction</w:t>
-      </w:r>
-    </w:p>
-    <w:p>
-      <w:r>
-        <w:t>CSD460</w:t>
+      <w:pPr>
+        <w:jc w:val="center"/>
+        <w:rPr>
+          <w:b/>
+          <w:bCs/>
+        </w:rPr>
+      </w:pPr>
+      <w:r>
+        <w:rPr>
+          <w:b/>
+          <w:bCs/>
+        </w:rPr>
+        <w:t xml:space="preserve">CSD460 Module 1 </w:t>
+      </w:r>
+      <w:r>
+        <w:rPr>
+          <w:b/>
+          <w:bCs/>
+        </w:rPr>
+        <w:t>Introduction</w:t>
       </w:r>
     </w:p>
     <w:p/>

</xml_diff>

<commit_message>
Complete purpose and terminology sections
</commit_message>
<xml_diff>
--- a/Module 1/Introduction/MoffatBayMarinaProject_Introduction.docx
+++ b/Module 1/Introduction/MoffatBayMarinaProject_Introduction.docx
@@ -1,6 +1,6 @@
 
 <file path=word/document.xml><?xml version="1.0" encoding="utf-8"?>
-<w:document xmlns:wpc="http://schemas.microsoft.com/office/word/2010/wordprocessingCanvas" xmlns:cx="http://schemas.microsoft.com/office/drawing/2014/chartex" xmlns:cx1="http://schemas.microsoft.com/office/drawing/2015/9/8/chartex" xmlns:cx2="http://schemas.microsoft.com/office/drawing/2015/10/21/chartex" xmlns:cx3="http://schemas.microsoft.com/office/drawing/2016/5/9/chartex" xmlns:cx4="http://schemas.microsoft.com/office/drawing/2016/5/10/chartex" xmlns:cx5="http://schemas.microsoft.com/office/drawing/2016/5/11/chartex" xmlns:cx6="http://schemas.microsoft.com/office/drawing/2016/5/12/chartex" xmlns:cx7="http://schemas.microsoft.com/office/drawing/2016/5/13/chartex" xmlns:cx8="http://schemas.microsoft.com/office/drawing/2016/5/14/chartex" xmlns:mc="http://schemas.openxmlformats.org/markup-compatibility/2006" xmlns:m="http://schemas.openxmlformats.org/officeDocument/2006/math" xmlns:aink="http://schemas.microsoft.com/office/drawing/2016/ink" xmlns:am3d="http://schemas.microsoft.com/office/drawing/2017/model3d" xmlns:oel="http://schemas.microsoft.com/office/2019/extlst" xmlns:r="http://schemas.openxmlformats.org/officeDocument/2006/relationships" xmlns:wp14="http://schemas.microsoft.com/office/word/2010/wordprocessingDrawing" xmlns:wp="http://schemas.openxmlformats.org/drawingml/2006/wordprocessingDrawing" xmlns:wpg="http://schemas.microsoft.com/office/word/2010/wordprocessingGroup" xmlns:wpi="http://schemas.microsoft.com/office/word/2010/wordprocessingInk" xmlns:wps="http://schemas.microsoft.com/office/word/2010/wordprocessingShape" xmlns:o="urn:schemas-microsoft-com:office:office" xmlns:v="urn:schemas-microsoft-com:vml" xmlns:w10="urn:schemas-microsoft-com:office:word" xmlns:w="http://schemas.openxmlformats.org/wordprocessingml/2006/main" xmlns:w14="http://schemas.microsoft.com/office/word/2010/wordml" xmlns:w15="http://schemas.microsoft.com/office/word/2012/wordml" xmlns:w16cex="http://schemas.microsoft.com/office/word/2018/wordml/cex" xmlns:w16cid="http://schemas.microsoft.com/office/word/2016/wordml/cid" xmlns:w16="http://schemas.microsoft.com/office/word/2018/wordml" xmlns:w16sdtdh="http://schemas.microsoft.com/office/word/2020/wordml/sdtdatahash" xmlns:w16sdtfl="http://schemas.microsoft.com/office/word/2024/wordml/sdtformatlock" xmlns:w16se="http://schemas.microsoft.com/office/word/2015/wordml/symex" xmlns:w16du="http://schemas.microsoft.com/office/word/2023/wordml/word16du" xmlns:wne="http://schemas.microsoft.com/office/word/2006/wordml" mc:Ignorable="w14 w15 w16se w16cid w16 w16cex w16sdtdh w16sdtfl w16du wp14">
+<w:document xmlns:wpc="http://schemas.microsoft.com/office/word/2010/wordprocessingCanvas" xmlns:cx="http://schemas.microsoft.com/office/drawing/2014/chartex" xmlns:cx1="http://schemas.microsoft.com/office/drawing/2015/9/8/chartex" xmlns:cx2="http://schemas.microsoft.com/office/drawing/2015/10/21/chartex" xmlns:cx3="http://schemas.microsoft.com/office/drawing/2016/5/9/chartex" xmlns:cx4="http://schemas.microsoft.com/office/drawing/2016/5/10/chartex" xmlns:cx5="http://schemas.microsoft.com/office/drawing/2016/5/11/chartex" xmlns:cx6="http://schemas.microsoft.com/office/drawing/2016/5/12/chartex" xmlns:cx7="http://schemas.microsoft.com/office/drawing/2016/5/13/chartex" xmlns:cx8="http://schemas.microsoft.com/office/drawing/2016/5/14/chartex" xmlns:mc="http://schemas.openxmlformats.org/markup-compatibility/2006" xmlns:aink="http://schemas.microsoft.com/office/drawing/2016/ink" xmlns:am3d="http://schemas.microsoft.com/office/drawing/2017/model3d" xmlns:o="urn:schemas-microsoft-com:office:office" xmlns:oel="http://schemas.microsoft.com/office/2019/extlst" xmlns:r="http://schemas.openxmlformats.org/officeDocument/2006/relationships" xmlns:m="http://schemas.openxmlformats.org/officeDocument/2006/math" xmlns:v="urn:schemas-microsoft-com:vml" xmlns:wp14="http://schemas.microsoft.com/office/word/2010/wordprocessingDrawing" xmlns:wp="http://schemas.openxmlformats.org/drawingml/2006/wordprocessingDrawing" xmlns:w10="urn:schemas-microsoft-com:office:word" xmlns:w="http://schemas.openxmlformats.org/wordprocessingml/2006/main" xmlns:w14="http://schemas.microsoft.com/office/word/2010/wordml" xmlns:w15="http://schemas.microsoft.com/office/word/2012/wordml" xmlns:w16cei="http://schemas.microsoft.com/office/word/2026/wordml/cei" xmlns:w16cex="http://schemas.microsoft.com/office/word/2018/wordml/cex" xmlns:w16cid="http://schemas.microsoft.com/office/word/2016/wordml/cid" xmlns:w16="http://schemas.microsoft.com/office/word/2018/wordml" xmlns:w16du="http://schemas.microsoft.com/office/word/2023/wordml/word16du" xmlns:w16sdtdh="http://schemas.microsoft.com/office/word/2020/wordml/sdtdatahash" xmlns:w16sdtfl="http://schemas.microsoft.com/office/word/2024/wordml/sdtformatlock" xmlns:w16se="http://schemas.microsoft.com/office/word/2015/wordml/symex" xmlns:wpg="http://schemas.microsoft.com/office/word/2010/wordprocessingGroup" xmlns:wpi="http://schemas.microsoft.com/office/word/2010/wordprocessingInk" xmlns:wne="http://schemas.microsoft.com/office/word/2006/wordml" xmlns:wps="http://schemas.microsoft.com/office/word/2010/wordprocessingShape" mc:Ignorable="w14 w15 w16se w16cid w16 w16cex w16sdtdh w16sdtfl w16du wp14">
   <w:body>
     <w:p>
       <w:pPr>
@@ -52,21 +52,12 @@
         </w:rPr>
         <w:t xml:space="preserve">, </w:t>
       </w:r>
-      <w:proofErr w:type="spellStart"/>
-      <w:r>
-        <w:rPr>
-          <w:b/>
-          <w:bCs/>
-        </w:rPr>
-        <w:t>Aftabur</w:t>
-      </w:r>
-      <w:proofErr w:type="spellEnd"/>
-      <w:r>
-        <w:rPr>
-          <w:b/>
-          <w:bCs/>
-        </w:rPr>
-        <w:t xml:space="preserve"> Rahman</w:t>
+      <w:r>
+        <w:rPr>
+          <w:b/>
+          <w:bCs/>
+        </w:rPr>
+        <w:t>Aftabur Rahman</w:t>
       </w:r>
     </w:p>
     <w:p>
@@ -114,27 +105,7 @@
         <w:pStyle w:val="isselectedend"/>
       </w:pPr>
       <w:r>
-        <w:t xml:space="preserve">The Moffat Bay Marina project is </w:t>
-      </w:r>
-      <w:r>
-        <w:t xml:space="preserve">our </w:t>
-      </w:r>
-      <w:r>
-        <w:t xml:space="preserve">website </w:t>
-      </w:r>
-      <w:r>
-        <w:t>that is b</w:t>
-      </w:r>
-      <w:r>
-        <w:t xml:space="preserve">eing developed for the new marina located at Moffat Bay on </w:t>
-      </w:r>
-      <w:proofErr w:type="spellStart"/>
-      <w:r>
-        <w:t>Joviedsa</w:t>
-      </w:r>
-      <w:proofErr w:type="spellEnd"/>
-      <w:r>
-        <w:t xml:space="preserve"> Island, Washington State. The marina is being completed as part of the larger Moffat Bay resort project. The purpose of the website is to give visitors an easy way to learn more about the marina, view available services, create an account, reserve marina space, and look up existing reservations.</w:t>
+        <w:t>The Moffat Bay Marina project is our website that is being developed for the new marina located at Moffat Bay on Joviedsa Island, Washington State. The marina is being completed as part of the larger Moffat Bay resort project. The purpose of the website is to give visitors an easy way to learn more about the marina, view available services, create an account, reserve marina space, and look up existing reservations.</w:t>
       </w:r>
     </w:p>
     <w:p>
@@ -142,19 +113,7 @@
         <w:pStyle w:val="isselectedend"/>
       </w:pPr>
       <w:r>
-        <w:t xml:space="preserve">As </w:t>
-      </w:r>
-      <w:r>
-        <w:t>we</w:t>
-      </w:r>
-      <w:r>
-        <w:t xml:space="preserve"> work through this project, </w:t>
-      </w:r>
-      <w:r>
-        <w:t>our</w:t>
-      </w:r>
-      <w:r>
-        <w:t xml:space="preserve"> main goal is to create a website that is simple for customers to use while also making sure their account and reservation information is stored correctly in the database. Visitors will be able to browse the public parts of the website without logging in. If a customer decides that they want to reserve a marina slip, they will need to either register for a new account or log into an existing account.</w:t>
+        <w:t>As we work through this project, our main goal is to create a website that is simple for customers to use while also making sure their account and reservation information is stored correctly in the database. Visitors will be able to browse the public parts of the website without logging in. If a customer decides that they want to reserve a marina slip, they will need to either register for a new account or log into an existing account.</w:t>
       </w:r>
     </w:p>
     <w:p>
@@ -164,6 +123,541 @@
       <w:r>
         <w:t>Once the customer is logged in, they will be able to enter the information needed for their marina reservation, review the reservation details, and confirm the reservation. After the reservation has been confirmed, the information will be sent to the database and stored so it can be retrieved later through the Reservation Lookup page.</w:t>
       </w:r>
+    </w:p>
+    <w:p>
+      <w:pPr>
+        <w:pStyle w:val="NormalWeb"/>
+      </w:pPr>
+      <w:r>
+        <w:rPr>
+          <w:b/>
+          <w:bCs/>
+        </w:rPr>
+        <w:t>1.1 Purpose</w:t>
+      </w:r>
+    </w:p>
+    <w:p>
+      <w:pPr>
+        <w:pStyle w:val="NormalWeb"/>
+      </w:pPr>
+      <w:r>
+        <w:t>The purpose of the Moffat Bay Marina website is to provide customers with a convenient and user-friendly way to learn about the marina and manage marina slip reservations online. The website will allow visitors to view information about Moffat Bay Marina and its available services without requiring an account. Customers who wish to make a reservation will be able to create an account or log into an existing account, provide the necessary boat and reservation information, review their reservation details, and confirm their reservation.</w:t>
+      </w:r>
+    </w:p>
+    <w:p>
+      <w:pPr>
+        <w:pStyle w:val="NormalWeb"/>
+      </w:pPr>
+      <w:r>
+        <w:t>The website will also provide registered customers with the ability to locate previously submitted reservation information through the Reservation Lookup feature. Customer account information, boat information, and reservation details will be stored in the database so that the information can be securely maintained and retrieved when needed. Overall, the website is intended to simplify the reservation process for customers while providing Moffat Bay Marina with an organized and reliable system for managing customer and reservation information.</w:t>
+      </w:r>
+    </w:p>
+    <w:p>
+      <w:pPr>
+        <w:pStyle w:val="NormalWeb"/>
+        <w:rPr>
+          <w:b/>
+          <w:bCs/>
+        </w:rPr>
+      </w:pPr>
+      <w:r>
+        <w:rPr>
+          <w:b/>
+          <w:bCs/>
+        </w:rPr>
+        <w:t>1.2 Terminology</w:t>
+      </w:r>
+    </w:p>
+    <w:p>
+      <w:pPr>
+        <w:pStyle w:val="NormalWeb"/>
+        <w:rPr>
+          <w:b/>
+          <w:bCs/>
+        </w:rPr>
+      </w:pPr>
+      <w:r>
+        <w:rPr>
+          <w:b/>
+          <w:bCs/>
+          <w:u w:val="single"/>
+        </w:rPr>
+        <w:t>Moffat Bay Marina:</w:t>
+      </w:r>
+      <w:r>
+        <w:rPr>
+          <w:b/>
+          <w:bCs/>
+        </w:rPr>
+        <w:br/>
+      </w:r>
+      <w:r>
+        <w:t>The marina facility located at Moffat Bay on Joviedsa Island.</w:t>
+      </w:r>
+    </w:p>
+    <w:p>
+      <w:pPr>
+        <w:pStyle w:val="NormalWeb"/>
+      </w:pPr>
+      <w:r>
+        <w:rPr>
+          <w:b/>
+          <w:bCs/>
+          <w:u w:val="single"/>
+        </w:rPr>
+        <w:lastRenderedPageBreak/>
+        <w:t>User:</w:t>
+      </w:r>
+      <w:r>
+        <w:rPr>
+          <w:b/>
+          <w:bCs/>
+        </w:rPr>
+        <w:br/>
+      </w:r>
+      <w:r>
+        <w:t>Anyone who visits the Moffat Bay Marina website.</w:t>
+      </w:r>
+    </w:p>
+    <w:p>
+      <w:pPr>
+        <w:pStyle w:val="NormalWeb"/>
+        <w:rPr>
+          <w:b/>
+          <w:bCs/>
+        </w:rPr>
+      </w:pPr>
+      <w:r>
+        <w:rPr>
+          <w:b/>
+          <w:bCs/>
+          <w:u w:val="single"/>
+        </w:rPr>
+        <w:t>Customer:</w:t>
+      </w:r>
+      <w:r>
+        <w:rPr>
+          <w:b/>
+          <w:bCs/>
+        </w:rPr>
+        <w:br/>
+      </w:r>
+      <w:r>
+        <w:t>A person who uses the website to learn about the marina or reserve a marina slip.</w:t>
+      </w:r>
+    </w:p>
+    <w:p>
+      <w:pPr>
+        <w:pStyle w:val="NormalWeb"/>
+        <w:rPr>
+          <w:b/>
+          <w:bCs/>
+        </w:rPr>
+      </w:pPr>
+      <w:r>
+        <w:rPr>
+          <w:b/>
+          <w:bCs/>
+          <w:u w:val="single"/>
+        </w:rPr>
+        <w:t>Registered User:</w:t>
+      </w:r>
+      <w:r>
+        <w:rPr>
+          <w:b/>
+          <w:bCs/>
+        </w:rPr>
+        <w:br/>
+      </w:r>
+      <w:r>
+        <w:t>A customer who has created an account with Moffat Bay Marina.</w:t>
+      </w:r>
+    </w:p>
+    <w:p>
+      <w:pPr>
+        <w:pStyle w:val="NormalWeb"/>
+        <w:rPr>
+          <w:b/>
+          <w:bCs/>
+        </w:rPr>
+      </w:pPr>
+      <w:r>
+        <w:rPr>
+          <w:b/>
+          <w:bCs/>
+          <w:u w:val="single"/>
+        </w:rPr>
+        <w:t>Authentication:</w:t>
+      </w:r>
+      <w:r>
+        <w:rPr>
+          <w:b/>
+          <w:bCs/>
+        </w:rPr>
+        <w:br/>
+      </w:r>
+      <w:r>
+        <w:t>The process of verifying that a customer's login credentials are correct.</w:t>
+      </w:r>
+    </w:p>
+    <w:p>
+      <w:pPr>
+        <w:pStyle w:val="NormalWeb"/>
+        <w:rPr>
+          <w:b/>
+          <w:bCs/>
+        </w:rPr>
+      </w:pPr>
+      <w:r>
+        <w:rPr>
+          <w:b/>
+          <w:bCs/>
+          <w:u w:val="single"/>
+        </w:rPr>
+        <w:t>Registration:</w:t>
+      </w:r>
+      <w:r>
+        <w:rPr>
+          <w:b/>
+          <w:bCs/>
+        </w:rPr>
+        <w:br/>
+      </w:r>
+      <w:r>
+        <w:t>The process of creating a new customer account.</w:t>
+      </w:r>
+    </w:p>
+    <w:p>
+      <w:pPr>
+        <w:pStyle w:val="NormalWeb"/>
+        <w:rPr>
+          <w:b/>
+          <w:bCs/>
+        </w:rPr>
+      </w:pPr>
+      <w:r>
+        <w:rPr>
+          <w:b/>
+          <w:bCs/>
+          <w:u w:val="single"/>
+        </w:rPr>
+        <w:t>Login:</w:t>
+      </w:r>
+      <w:r>
+        <w:rPr>
+          <w:b/>
+          <w:bCs/>
+        </w:rPr>
+        <w:br/>
+      </w:r>
+      <w:r>
+        <w:t>The process where an existing customer enters their username or email address and password to access their account.</w:t>
+      </w:r>
+    </w:p>
+    <w:p>
+      <w:pPr>
+        <w:pStyle w:val="NormalWeb"/>
+        <w:rPr>
+          <w:b/>
+          <w:bCs/>
+        </w:rPr>
+      </w:pPr>
+      <w:r>
+        <w:rPr>
+          <w:b/>
+          <w:bCs/>
+          <w:u w:val="single"/>
+        </w:rPr>
+        <w:t>Marina Slip:</w:t>
+      </w:r>
+      <w:r>
+        <w:rPr>
+          <w:b/>
+          <w:bCs/>
+          <w:u w:val="single"/>
+        </w:rPr>
+        <w:br/>
+      </w:r>
+      <w:r>
+        <w:t>A designated location within the marina where a customer's boat can be docked.</w:t>
+      </w:r>
+    </w:p>
+    <w:p>
+      <w:pPr>
+        <w:pStyle w:val="NormalWeb"/>
+        <w:rPr>
+          <w:b/>
+          <w:bCs/>
+        </w:rPr>
+      </w:pPr>
+      <w:r>
+        <w:rPr>
+          <w:b/>
+          <w:bCs/>
+          <w:u w:val="single"/>
+        </w:rPr>
+        <w:t>Reservation:</w:t>
+      </w:r>
+      <w:r>
+        <w:rPr>
+          <w:b/>
+          <w:bCs/>
+        </w:rPr>
+        <w:br/>
+      </w:r>
+      <w:r>
+        <w:t>A record containing the customer's requested dates, boat information, marina slip information, and other details associated with their stay.</w:t>
+      </w:r>
+    </w:p>
+    <w:p>
+      <w:pPr>
+        <w:pStyle w:val="NormalWeb"/>
+        <w:rPr>
+          <w:b/>
+          <w:bCs/>
+        </w:rPr>
+      </w:pPr>
+      <w:r>
+        <w:rPr>
+          <w:b/>
+          <w:bCs/>
+          <w:u w:val="single"/>
+        </w:rPr>
+        <w:t>Boat Information:</w:t>
+      </w:r>
+      <w:r>
+        <w:rPr>
+          <w:b/>
+          <w:bCs/>
+        </w:rPr>
+        <w:br/>
+      </w:r>
+      <w:r>
+        <w:t>Information about the customer's boat, such as the boat name, type, length, or other information needed to determine the appropriate marina space.</w:t>
+      </w:r>
+    </w:p>
+    <w:p>
+      <w:pPr>
+        <w:pStyle w:val="NormalWeb"/>
+        <w:rPr>
+          <w:b/>
+          <w:bCs/>
+        </w:rPr>
+      </w:pPr>
+      <w:r>
+        <w:rPr>
+          <w:b/>
+          <w:bCs/>
+          <w:u w:val="single"/>
+        </w:rPr>
+        <w:t>Check-In Date:</w:t>
+      </w:r>
+      <w:r>
+        <w:rPr>
+          <w:b/>
+          <w:bCs/>
+        </w:rPr>
+        <w:br/>
+      </w:r>
+      <w:r>
+        <w:t>The date the customer plans to arrive at Moffat Bay Marina.</w:t>
+      </w:r>
+    </w:p>
+    <w:p>
+      <w:pPr>
+        <w:pStyle w:val="NormalWeb"/>
+        <w:rPr>
+          <w:b/>
+          <w:bCs/>
+        </w:rPr>
+      </w:pPr>
+      <w:r>
+        <w:rPr>
+          <w:b/>
+          <w:bCs/>
+          <w:u w:val="single"/>
+        </w:rPr>
+        <w:t>Check-Out Date:</w:t>
+      </w:r>
+      <w:r>
+        <w:rPr>
+          <w:b/>
+          <w:bCs/>
+        </w:rPr>
+        <w:br/>
+      </w:r>
+      <w:r>
+        <w:t>The date the customer plans to leave the marina.</w:t>
+      </w:r>
+    </w:p>
+    <w:p>
+      <w:pPr>
+        <w:pStyle w:val="NormalWeb"/>
+        <w:rPr>
+          <w:b/>
+          <w:bCs/>
+        </w:rPr>
+      </w:pPr>
+      <w:r>
+        <w:rPr>
+          <w:b/>
+          <w:bCs/>
+          <w:u w:val="single"/>
+        </w:rPr>
+        <w:t>Reservation Confirmation:</w:t>
+      </w:r>
+      <w:r>
+        <w:rPr>
+          <w:b/>
+          <w:bCs/>
+        </w:rPr>
+        <w:br/>
+      </w:r>
+      <w:r>
+        <w:t>The step where the customer reviews the entered information and confirms that they want to make the reservation.</w:t>
+      </w:r>
+    </w:p>
+    <w:p>
+      <w:pPr>
+        <w:pStyle w:val="NormalWeb"/>
+        <w:rPr>
+          <w:b/>
+          <w:bCs/>
+        </w:rPr>
+      </w:pPr>
+      <w:r>
+        <w:rPr>
+          <w:b/>
+          <w:bCs/>
+          <w:u w:val="single"/>
+        </w:rPr>
+        <w:t>Reservation Lookup:</w:t>
+      </w:r>
+      <w:r>
+        <w:rPr>
+          <w:b/>
+          <w:bCs/>
+        </w:rPr>
+        <w:br/>
+      </w:r>
+      <w:r>
+        <w:t>A page that allows registered customers to locate and view previously submitted reservation information.</w:t>
+      </w:r>
+    </w:p>
+    <w:p>
+      <w:pPr>
+        <w:pStyle w:val="NormalWeb"/>
+        <w:rPr>
+          <w:b/>
+          <w:bCs/>
+        </w:rPr>
+      </w:pPr>
+      <w:r>
+        <w:rPr>
+          <w:b/>
+          <w:bCs/>
+          <w:u w:val="single"/>
+        </w:rPr>
+        <w:t>Database:</w:t>
+      </w:r>
+      <w:r>
+        <w:rPr>
+          <w:b/>
+          <w:bCs/>
+        </w:rPr>
+        <w:br/>
+      </w:r>
+      <w:r>
+        <w:t>The system used to permanently store registered users and reservation records.</w:t>
+      </w:r>
+    </w:p>
+    <w:p>
+      <w:pPr>
+        <w:pStyle w:val="NormalWeb"/>
+      </w:pPr>
+      <w:r>
+        <w:rPr>
+          <w:b/>
+          <w:bCs/>
+          <w:u w:val="single"/>
+        </w:rPr>
+        <w:lastRenderedPageBreak/>
+        <w:t>Primary Key:</w:t>
+      </w:r>
+      <w:r>
+        <w:rPr>
+          <w:b/>
+          <w:bCs/>
+        </w:rPr>
+        <w:br/>
+      </w:r>
+      <w:r>
+        <w:t>A unique value used by the database to identify an individual record.</w:t>
+      </w:r>
+    </w:p>
+    <w:p>
+      <w:pPr>
+        <w:pStyle w:val="NormalWeb"/>
+      </w:pPr>
+      <w:r>
+        <w:rPr>
+          <w:b/>
+          <w:bCs/>
+          <w:u w:val="single"/>
+        </w:rPr>
+        <w:t>Foreign Key:</w:t>
+      </w:r>
+      <w:r>
+        <w:rPr>
+          <w:b/>
+          <w:bCs/>
+        </w:rPr>
+        <w:br/>
+      </w:r>
+      <w:r>
+        <w:t>A value used to connect related information between database tables.</w:t>
+      </w:r>
+    </w:p>
+    <w:p>
+      <w:pPr>
+        <w:pStyle w:val="NormalWeb"/>
+        <w:rPr>
+          <w:b/>
+          <w:bCs/>
+        </w:rPr>
+      </w:pPr>
+      <w:r>
+        <w:rPr>
+          <w:b/>
+          <w:bCs/>
+          <w:u w:val="single"/>
+        </w:rPr>
+        <w:t>Session:</w:t>
+      </w:r>
+      <w:r>
+        <w:rPr>
+          <w:b/>
+          <w:bCs/>
+        </w:rPr>
+        <w:br/>
+      </w:r>
+      <w:r>
+        <w:t>A way for the website to remember that a customer has successfully logged in while they move between different pages.</w:t>
+      </w:r>
+    </w:p>
+    <w:p>
+      <w:pPr>
+        <w:pStyle w:val="NormalWeb"/>
+        <w:rPr>
+          <w:b/>
+          <w:bCs/>
+        </w:rPr>
+      </w:pPr>
+    </w:p>
+    <w:p>
+      <w:pPr>
+        <w:pStyle w:val="NormalWeb"/>
+      </w:pPr>
     </w:p>
     <w:sectPr>
       <w:pgSz w:w="12240" w:h="15840"/>
@@ -176,7 +670,7 @@
 </file>
 
 <file path=word/styles.xml><?xml version="1.0" encoding="utf-8"?>
-<w:styles xmlns:mc="http://schemas.openxmlformats.org/markup-compatibility/2006" xmlns:r="http://schemas.openxmlformats.org/officeDocument/2006/relationships" xmlns:w="http://schemas.openxmlformats.org/wordprocessingml/2006/main" xmlns:w14="http://schemas.microsoft.com/office/word/2010/wordml" xmlns:w15="http://schemas.microsoft.com/office/word/2012/wordml" xmlns:w16cex="http://schemas.microsoft.com/office/word/2018/wordml/cex" xmlns:w16cid="http://schemas.microsoft.com/office/word/2016/wordml/cid" xmlns:w16="http://schemas.microsoft.com/office/word/2018/wordml" xmlns:w16sdtdh="http://schemas.microsoft.com/office/word/2020/wordml/sdtdatahash" xmlns:w16sdtfl="http://schemas.microsoft.com/office/word/2024/wordml/sdtformatlock" xmlns:w16se="http://schemas.microsoft.com/office/word/2015/wordml/symex" xmlns:w16du="http://schemas.microsoft.com/office/word/2023/wordml/word16du" mc:Ignorable="w14 w15 w16se w16cid w16 w16cex w16sdtdh w16sdtfl w16du">
+<w:styles xmlns:mc="http://schemas.openxmlformats.org/markup-compatibility/2006" xmlns:r="http://schemas.openxmlformats.org/officeDocument/2006/relationships" xmlns:w="http://schemas.openxmlformats.org/wordprocessingml/2006/main" xmlns:w14="http://schemas.microsoft.com/office/word/2010/wordml" xmlns:w15="http://schemas.microsoft.com/office/word/2012/wordml" xmlns:w16cex="http://schemas.microsoft.com/office/word/2018/wordml/cex" xmlns:w16cid="http://schemas.microsoft.com/office/word/2016/wordml/cid" xmlns:w16="http://schemas.microsoft.com/office/word/2018/wordml" xmlns:w16du="http://schemas.microsoft.com/office/word/2023/wordml/word16du" xmlns:w16sdtdh="http://schemas.microsoft.com/office/word/2020/wordml/sdtdatahash" xmlns:w16sdtfl="http://schemas.microsoft.com/office/word/2024/wordml/sdtformatlock" xmlns:w16se="http://schemas.microsoft.com/office/word/2015/wordml/symex" mc:Ignorable="w14 w15 w16se w16cid w16 w16cex w16sdtdh w16sdtfl w16du">
   <w:docDefaults>
     <w:rPrDefault>
       <w:rPr>
@@ -778,7 +1272,6 @@
   <w:style w:type="character" w:default="1" w:styleId="DefaultParagraphFont">
     <w:name w:val="Default Paragraph Font"/>
     <w:uiPriority w:val="1"/>
-    <w:semiHidden/>
     <w:unhideWhenUsed/>
   </w:style>
   <w:style w:type="table" w:default="1" w:styleId="TableNormal">

</xml_diff>